<commit_message>
Adicio projetos académicos, CV em PDF e versão EN
</commit_message>
<xml_diff>
--- a/CV_Francisco_Vaz.docx
+++ b/CV_Francisco_Vaz.docx
@@ -42,7 +42,7 @@
           <w:sz w:val="18"/>
           <w:szCs w:val="18"/>
         </w:rPr>
-        <w:t xml:space="preserve">cunha.vaz@sapo.pt</w:t>
+        <w:t xml:space="preserve">francisco.vaz@sapo.pt</w:t>
       </w:r>
       <w:r>
         <w:rPr>
@@ -2788,6 +2788,130 @@
         </w:tc>
       </w:tr>
     </w:tbl>
+    <w:p>
+      <w:pPr>
+        <w:pBdr>
+          <w:bottom w:val="single" w:color="2E75B6" w:sz="8" w:space="4"/>
+        </w:pBdr>
+        <w:spacing w:after="120" w:before="280"/>
+      </w:pPr>
+      <w:r>
+        <w:rPr>
+          <w:b/>
+          <w:bCs/>
+          <w:color w:val="1F3864"/>
+          <w:sz w:val="26"/>
+          <w:szCs w:val="26"/>
+        </w:rPr>
+        <w:t xml:space="preserve">PROJETOS ACADÉMICOS · PORTEFÓLIO IA / ML</w:t>
+      </w:r>
+    </w:p>
+    <w:p>
+      <w:pPr>
+        <w:spacing w:after="100"/>
+      </w:pPr>
+      <w:r>
+        <w:rPr>
+          <w:sz w:val="20"/>
+          <w:szCs w:val="20"/>
+        </w:rPr>
+        <w:t xml:space="preserve">Trabalhos desenvolvidos no âmbito de formação avançada em IA, com código público em </w:t>
+      </w:r>
+      <w:r>
+        <w:rPr>
+          <w:b/>
+          <w:bCs/>
+          <w:color w:val="1F3864"/>
+          <w:sz w:val="20"/>
+          <w:szCs w:val="20"/>
+        </w:rPr>
+        <w:t xml:space="preserve">github.com/CunhaVaz</w:t>
+      </w:r>
+    </w:p>
+    <w:p>
+      <w:pPr>
+        <w:spacing w:after="80"/>
+      </w:pPr>
+      <w:r>
+        <w:rPr>
+          <w:b/>
+          <w:bCs/>
+          <w:sz w:val="20"/>
+          <w:szCs w:val="20"/>
+        </w:rPr>
+        <w:t xml:space="preserve">• Segmentação de Áreas Inundadas — </w:t>
+      </w:r>
+      <w:r>
+        <w:rPr>
+          <w:sz w:val="20"/>
+          <w:szCs w:val="20"/>
+        </w:rPr>
+        <w:t xml:space="preserve">Visão por computador para deteção de zonas inundadas em fotografias aéreas. Rede neural U-Net em PyTorch (semantic segmentation binária). Dataset Flood Area Segmentation (Kaggle, 290 pares imagem/máscara). Resultado: IoU = 0.7225 em teste. IADE — Visão por Computador, 2026.</w:t>
+      </w:r>
+    </w:p>
+    <w:p>
+      <w:pPr>
+        <w:spacing w:after="80"/>
+      </w:pPr>
+      <w:r>
+        <w:rPr>
+          <w:b/>
+          <w:bCs/>
+          <w:sz w:val="20"/>
+          <w:szCs w:val="20"/>
+        </w:rPr>
+        <w:t xml:space="preserve">• Diagnóstico de Tumores de Pele com Computer Vision — </w:t>
+      </w:r>
+      <w:r>
+        <w:rPr>
+          <w:sz w:val="20"/>
+          <w:szCs w:val="20"/>
+        </w:rPr>
+        <w:t xml:space="preserve">Classificação de tumores como malignos ou benignos com Transfer Learning (ResNet18, PyTorch). Dataset Skin Cancer Malignant vs. Benign (3297 imagens dermatoscópicas). Resultado: 83.94% de accuracy em teste (melhor: 85.15%). IADE — Visão por Computador.</w:t>
+      </w:r>
+    </w:p>
+    <w:p>
+      <w:pPr>
+        <w:spacing w:after="80"/>
+      </w:pPr>
+      <w:r>
+        <w:rPr>
+          <w:b/>
+          <w:bCs/>
+          <w:sz w:val="20"/>
+          <w:szCs w:val="20"/>
+        </w:rPr>
+        <w:t xml:space="preserve">• Análise de Sentimentos em Músicas — </w:t>
+      </w:r>
+      <w:r>
+        <w:rPr>
+          <w:sz w:val="20"/>
+          <w:szCs w:val="20"/>
+        </w:rPr>
+        <w:t xml:space="preserve">Pipeline de NLP comparando sentimentos em músicas dos anos 80 vs. atuais. Transcrição áudio → texto com SpeechRecognition e PyDub; análise de sentimentos com Transformers (Hugging Face). Visualização e comparação por época.</w:t>
+      </w:r>
+    </w:p>
+    <w:p>
+      <w:pPr>
+        <w:spacing w:after="200"/>
+      </w:pPr>
+      <w:r>
+        <w:rPr>
+          <w:b/>
+          <w:bCs/>
+          <w:sz w:val="20"/>
+          <w:szCs w:val="20"/>
+        </w:rPr>
+        <w:t xml:space="preserve">• Explicabilidade e Regulamentação em IA — </w:t>
+      </w:r>
+      <w:r>
+        <w:rPr>
+          <w:sz w:val="20"/>
+          <w:szCs w:val="20"/>
+        </w:rPr>
+        <w:t xml:space="preserve">Projeto integrado de Machine Learning sobre o dataset Diabetes 130-US Hospitals (UCI / Kaggle, ~101 mil registos, 50 variáveis, target: readmissão hospitalar). Pipeline completo: análise exploratória e preparação dos dados, treino e comparação de modelos interpretáveis (regressão logística, árvore de decisão) com modelos de caixa negra (Random Forest / SVM), aplicação de métodos de interpretabilidade global (PDP, importância de features, SHAP) e local (LIME, contrafactuais), e análise crítica de riscos algorítmicos, ética e enquadramento regulamentar (AI Act, RGPD). Mestrado em IA Aplicada, Universidade Europeia.</w:t>
+      </w:r>
+    </w:p>
     <w:p>
       <w:pPr>
         <w:pBdr>

</xml_diff>

<commit_message>
Atualização completa: IA Aplicada + Data Analytics
</commit_message>
<xml_diff>
--- a/CV_Francisco_Vaz.docx
+++ b/CV_Francisco_Vaz.docx
@@ -29,7 +29,7 @@
           <w:sz w:val="22"/>
           <w:szCs w:val="22"/>
         </w:rPr>
-        <w:t xml:space="preserve">Gestor Sénior · Transformação Digital &amp; IA · Operações e Qualidade · Liderança Internacional</w:t>
+        <w:t xml:space="preserve">Gestor Sénior · IA Aplicada · Data Analytics · Liderança Internacional</w:t>
       </w:r>
     </w:p>
     <w:p>
@@ -74,7 +74,7 @@
           <w:sz w:val="18"/>
           <w:szCs w:val="18"/>
         </w:rPr>
-        <w:t xml:space="preserve">  ·  Covilhã, Portugal</w:t>
+        <w:t xml:space="preserve">  ·  Portugal · Remoto / Internacional</w:t>
       </w:r>
     </w:p>
     <w:p>
@@ -104,7 +104,7 @@
           <w:sz w:val="20"/>
           <w:szCs w:val="20"/>
         </w:rPr>
-        <w:t xml:space="preserve">Gestor sénior com mais de 25 anos de experiência em operações industriais, qualidade, logística e consultoria, em contextos nacionais e internacionais (Portugal, Angola, RDC). Combina visão executiva, capacidade de implementação no terreno e competências técnicas em Inteligência Artificial aplicada — Python, Machine Learning, LLMs, Power BI, automação e construção de agentes. Vocacionado para projetos de transformação digital e IA em ambiente industrial, consultoria e operações, com forte experiência em liderança de equipas multiculturais e em ambientes de elevada complexidade. Fluente em português, espanhol e francês, com bom nível de inglês profissional.</w:t>
+        <w:t xml:space="preserve">Gestor sénior com mais de 25 anos de experiência em operações industriais, qualidade, logística e consultoria, em contextos nacionais e internacionais (Portugal, Angola, RDC). Combina visão executiva, capacidade de implementação no terreno e competências técnicas em Inteligência Artificial e Data Analytics — Python, Machine Learning, LLMs, Power BI, automação e agentes. Fluente em PT, ES, FR; bom nível de EN profissional.</w:t>
       </w:r>
     </w:p>
     <w:p>
@@ -116,7 +116,7 @@
           <w:sz w:val="20"/>
           <w:szCs w:val="20"/>
         </w:rPr>
-        <w:t xml:space="preserve">Procura contribuir para projetos de transformação digital, IA aplicada e Industry 4.0, alavancando uma rara combinação de experiência operacional sénior e competências técnicas atualizadas em IA. Disponibilidade total para colaborar em modelo nearshore a partir do interior de Portugal (Covilhã / Fundão) ou em projetos internacionais.</w:t>
+        <w:t xml:space="preserve">Disponível para projetos desafiantes em IA Aplicada, Data Analytics e transformação digital. Modalidade remota, presencial ou híbrida — em Portugal ou em projetos internacionais.</w:t>
       </w:r>
     </w:p>
     <w:p>
@@ -193,7 +193,7 @@
                 <w:sz w:val="18"/>
                 <w:szCs w:val="18"/>
               </w:rPr>
-              <w:t xml:space="preserve">LLMs · Machine Learning · Python · Power BI · n8n · automação de processos · IA generativa</w:t>
+              <w:t xml:space="preserve">LLMs · Machine Learning · Python · Power BI · n8n · automação · agentes</w:t>
             </w:r>
           </w:p>
         </w:tc>
@@ -226,16 +226,16 @@
                 <w:sz w:val="20"/>
                 <w:szCs w:val="20"/>
               </w:rPr>
-              <w:t xml:space="preserve">Consultoria &amp; Gestão</w:t>
-            </w:r>
-          </w:p>
-          <w:p>
-            <w:r>
-              <w:rPr>
-                <w:sz w:val="18"/>
-                <w:szCs w:val="18"/>
-              </w:rPr>
-              <w:t xml:space="preserve">Estratégia · transformação operacional · análise de investimentos · modelos de negócio</w:t>
+              <w:t xml:space="preserve">Data Analytics &amp; Consultoria</w:t>
+            </w:r>
+          </w:p>
+          <w:p>
+            <w:r>
+              <w:rPr>
+                <w:sz w:val="18"/>
+                <w:szCs w:val="18"/>
+              </w:rPr>
+              <w:t xml:space="preserve">Análise de dados · dashboards · estratégia · transformação operacional</w:t>
             </w:r>
           </w:p>
         </w:tc>
@@ -363,7 +363,7 @@
                 <w:sz w:val="18"/>
                 <w:szCs w:val="18"/>
               </w:rPr>
-              <w:t xml:space="preserve">Equipas multiculturais PT/AO/RDC · gestão de unidades fabris de raiz · negociação institucional</w:t>
+              <w:t xml:space="preserve">Equipas multiculturais PT/AO/RDC · unidades fabris de raiz</w:t>
             </w:r>
           </w:p>
         </w:tc>
@@ -405,7 +405,7 @@
                 <w:sz w:val="18"/>
                 <w:szCs w:val="18"/>
               </w:rPr>
-              <w:t xml:space="preserve">SAP · PHC · Primavera · MES · integração de dados back-office e operacionais</w:t>
+              <w:t xml:space="preserve">SAP · PHC · Primavera · MES · integração back-office e operacional</w:t>
             </w:r>
           </w:p>
         </w:tc>
@@ -560,7 +560,7 @@
                 <w:sz w:val="20"/>
                 <w:szCs w:val="20"/>
               </w:rPr>
-              <w:t xml:space="preserve">Pós-Graduação em Inteligência Artificial Aplicada à Gestão</w:t>
+              <w:t xml:space="preserve">Pós-Graduação em IA Aplicada à Gestão</w:t>
             </w:r>
           </w:p>
         </w:tc>
@@ -964,7 +964,7 @@
                 <w:sz w:val="20"/>
                 <w:szCs w:val="20"/>
               </w:rPr>
-              <w:t xml:space="preserve">Biagio Congo, S.A. — Kinshasa, República Democrática do Congo</w:t>
+              <w:t xml:space="preserve">Biagio Congo, S.A. — Kinshasa, RDC</w:t>
             </w:r>
           </w:p>
         </w:tc>
@@ -1034,7 +1034,7 @@
           <w:sz w:val="20"/>
           <w:szCs w:val="20"/>
         </w:rPr>
-        <w:t xml:space="preserve">Gestão integral de operações, logística e supply chain, incluindo importação de matérias-primas e distribuição de produto acabado.</w:t>
+        <w:t xml:space="preserve">Gestão integral de operações, logística e supply chain.</w:t>
       </w:r>
     </w:p>
     <w:p>
@@ -1051,7 +1051,7 @@
           <w:sz w:val="20"/>
           <w:szCs w:val="20"/>
         </w:rPr>
-        <w:t xml:space="preserve">Recrutamento, formação e liderança de equipa multidisciplinar de 5 a 10 colaboradores locais, promovendo cultura de qualidade, segurança e orientação ao cliente.</w:t>
+        <w:t xml:space="preserve">Recrutamento, formação e liderança de equipa multidisciplinar (5 a 10 colaboradores locais).</w:t>
       </w:r>
     </w:p>
     <w:p>
@@ -1068,7 +1068,7 @@
           <w:sz w:val="20"/>
           <w:szCs w:val="20"/>
         </w:rPr>
-        <w:t xml:space="preserve">Implementação de SOPs e sistemas de melhoria contínua com foco em eficiência operacional, controlo de custos e nível de serviço.</w:t>
+        <w:t xml:space="preserve">Implementação de SOPs e sistemas de melhoria contínua.</w:t>
       </w:r>
     </w:p>
     <w:p>
@@ -1085,7 +1085,7 @@
           <w:sz w:val="20"/>
           <w:szCs w:val="20"/>
         </w:rPr>
-        <w:t xml:space="preserve">Interlocução e negociação com autoridades governamentais, organismos oficiais e empresas privadas, num ambiente de negócios particularmente exigente.</w:t>
+        <w:t xml:space="preserve">Interlocução e negociação com autoridades governamentais e empresas privadas.</w:t>
       </w:r>
     </w:p>
     <w:tbl>
@@ -1195,7 +1195,7 @@
           <w:sz w:val="20"/>
           <w:szCs w:val="20"/>
         </w:rPr>
-        <w:t xml:space="preserve">Gestão global da qualidade, implementação e monitorização de sistemas HACCP e ISO 22000.</w:t>
+        <w:t xml:space="preserve">Gestão global da qualidade, HACCP e ISO 22000.</w:t>
       </w:r>
     </w:p>
     <w:p>
@@ -1212,7 +1212,7 @@
           <w:sz w:val="20"/>
           <w:szCs w:val="20"/>
         </w:rPr>
-        <w:t xml:space="preserve">Definição de KPIs e dashboards de controlo de qualidade em Power BI e análise de dados.</w:t>
+        <w:t xml:space="preserve">Definição de KPIs e dashboards em Power BI.</w:t>
       </w:r>
     </w:p>
     <w:p>
@@ -1229,7 +1229,7 @@
           <w:sz w:val="20"/>
           <w:szCs w:val="20"/>
         </w:rPr>
-        <w:t xml:space="preserve">Coordenação de auditorias internas e externas, garantindo conformidade legal, normativa e com clientes.</w:t>
+        <w:t xml:space="preserve">Coordenação de auditorias internas e externas.</w:t>
       </w:r>
     </w:p>
     <w:p>
@@ -1246,7 +1246,7 @@
           <w:sz w:val="20"/>
           <w:szCs w:val="20"/>
         </w:rPr>
-        <w:t xml:space="preserve">Introdução de IA aplicada à gestão de processos industriais e de qualidade — automação de relatórios, classificação de não-conformidades e análise preditiva.</w:t>
+        <w:t xml:space="preserve">Introdução de IA aplicada à gestão de processos industriais e de qualidade.</w:t>
       </w:r>
     </w:p>
     <w:tbl>
@@ -1356,7 +1356,7 @@
           <w:sz w:val="20"/>
           <w:szCs w:val="20"/>
         </w:rPr>
-        <w:t xml:space="preserve">Consultoria em gestão, operações, transformação digital e análise de investimentos para empresas de diversos setores.</w:t>
+        <w:t xml:space="preserve">Consultoria em gestão, operações, transformação digital e análise de investimentos.</w:t>
       </w:r>
     </w:p>
     <w:p>
@@ -1373,7 +1373,7 @@
           <w:sz w:val="20"/>
           <w:szCs w:val="20"/>
         </w:rPr>
-        <w:t xml:space="preserve">Apoio à definição de estratégias de crescimento, otimização operacional e desenho de modelos de negócio sustentáveis.</w:t>
+        <w:t xml:space="preserve">Apoio à definição de estratégias de crescimento e desenho de modelos de negócio.</w:t>
       </w:r>
     </w:p>
     <w:p>
@@ -1390,7 +1390,7 @@
           <w:sz w:val="20"/>
           <w:szCs w:val="20"/>
         </w:rPr>
-        <w:t xml:space="preserve">Construção de agentes de IA e workflows automatizados com LLMs, n8n, Zapier e integração de APIs.</w:t>
+        <w:t xml:space="preserve">Construção de agentes de IA e workflows automatizados (LLMs, n8n, Zapier, APIs).</w:t>
       </w:r>
     </w:p>
     <w:p>
@@ -1407,7 +1407,7 @@
           <w:sz w:val="20"/>
           <w:szCs w:val="20"/>
         </w:rPr>
-        <w:t xml:space="preserve">Marketing digital: estratégia de conteúdo, redes sociais, SEO/SEM, funis de conversão e campanhas pagas (Meta Ads, Google Ads).</w:t>
+        <w:t xml:space="preserve">Marketing digital: SEO/SEM, redes sociais, funis, Meta Ads, Google Ads.</w:t>
       </w:r>
     </w:p>
     <w:tbl>
@@ -1517,7 +1517,7 @@
           <w:sz w:val="20"/>
           <w:szCs w:val="20"/>
         </w:rPr>
-        <w:t xml:space="preserve">Direção de instituto focado em formação, investigação e promoção de bem-estar organizacional.</w:t>
+        <w:t xml:space="preserve">Direção de instituto focado em formação e bem-estar organizacional.</w:t>
       </w:r>
     </w:p>
     <w:p>
@@ -1534,7 +1534,7 @@
           <w:sz w:val="20"/>
           <w:szCs w:val="20"/>
         </w:rPr>
-        <w:t xml:space="preserve">Desenvolvimento de programas de gestão do stress, foco e bem-estar para equipas clínicas e organizacionais.</w:t>
+        <w:t xml:space="preserve">Programas de gestão do stress e foco para equipas clínicas e empresariais.</w:t>
       </w:r>
     </w:p>
     <w:tbl>
@@ -1591,7 +1591,7 @@
                 <w:sz w:val="20"/>
                 <w:szCs w:val="20"/>
               </w:rPr>
-              <w:t xml:space="preserve">Vivangola, S.A. / Agroangola, S.A. / Vivasuper, S.A. — Angola</w:t>
+              <w:t xml:space="preserve">Vivangola / Agroangola / Vivasuper — Angola</w:t>
             </w:r>
           </w:p>
         </w:tc>
@@ -1644,7 +1644,7 @@
           <w:sz w:val="20"/>
           <w:szCs w:val="20"/>
         </w:rPr>
-        <w:t xml:space="preserve">Gestão da cadeia logística em Angola: elevados níveis de serviço, disponibilidade de produto e controlo de custos.</w:t>
+        <w:t xml:space="preserve">Gestão da cadeia logística em Angola: armazéns, transporte, distribuição.</w:t>
       </w:r>
     </w:p>
     <w:p>
@@ -1661,7 +1661,7 @@
           <w:sz w:val="20"/>
           <w:szCs w:val="20"/>
         </w:rPr>
-        <w:t xml:space="preserve">Gestão de armazéns, transportes e distribuição; implementação de boas práticas de planeamento e controlo de inventário.</w:t>
+        <w:t xml:space="preserve">Boas práticas de planeamento e controlo de inventário.</w:t>
       </w:r>
     </w:p>
     <w:p>
@@ -1678,7 +1678,7 @@
           <w:sz w:val="20"/>
           <w:szCs w:val="20"/>
         </w:rPr>
-        <w:t xml:space="preserve">Coordenação de operações de retalho, abastecimento e rotação de produto em contexto angolano.</w:t>
+        <w:t xml:space="preserve">Coordenação de operações de retalho.</w:t>
       </w:r>
     </w:p>
     <w:p>
@@ -1923,7 +1923,7 @@
                 <w:sz w:val="18"/>
                 <w:szCs w:val="18"/>
               </w:rPr>
-              <w:t xml:space="preserve">Formador / Especialista em Gestão Industrial e Logística</w:t>
+              <w:t xml:space="preserve">Formador / Especialista</w:t>
             </w:r>
           </w:p>
         </w:tc>
@@ -2815,7 +2815,7 @@
           <w:sz w:val="20"/>
           <w:szCs w:val="20"/>
         </w:rPr>
-        <w:t xml:space="preserve">Trabalhos desenvolvidos no âmbito de formação avançada em IA, com código público em </w:t>
+        <w:t xml:space="preserve">Trabalhos com código público em </w:t>
       </w:r>
       <w:r>
         <w:rPr>
@@ -2846,7 +2846,7 @@
           <w:sz w:val="20"/>
           <w:szCs w:val="20"/>
         </w:rPr>
-        <w:t xml:space="preserve">Visão por computador para deteção de zonas inundadas em fotografias aéreas. Rede neural U-Net em PyTorch (semantic segmentation binária). Dataset Flood Area Segmentation (Kaggle, 290 pares imagem/máscara). Resultado: IoU = 0.7225 em teste. IADE — Visão por Computador, 2026.</w:t>
+        <w:t xml:space="preserve">U-Net em PyTorch (semantic segmentation binária). Dataset Flood Area Segmentation (Kaggle, 290 pares). Resultado: IoU = 0.7225 em teste. IADE — Visão por Computador, 2026.</w:t>
       </w:r>
     </w:p>
     <w:p>
@@ -2867,7 +2867,7 @@
           <w:sz w:val="20"/>
           <w:szCs w:val="20"/>
         </w:rPr>
-        <w:t xml:space="preserve">Classificação de tumores como malignos ou benignos com Transfer Learning (ResNet18, PyTorch). Dataset Skin Cancer Malignant vs. Benign (3297 imagens dermatoscópicas). Resultado: 83.94% de accuracy em teste (melhor: 85.15%). IADE — Visão por Computador.</w:t>
+        <w:t xml:space="preserve">Transfer Learning com ResNet18 (PyTorch). Dataset Skin Cancer (3297 imagens dermatoscópicas). Accuracy 83.94% em teste (melhor: 85.15%). IADE — Visão por Computador.</w:t>
       </w:r>
     </w:p>
     <w:p>
@@ -2888,7 +2888,7 @@
           <w:sz w:val="20"/>
           <w:szCs w:val="20"/>
         </w:rPr>
-        <w:t xml:space="preserve">Pipeline de NLP comparando sentimentos em músicas dos anos 80 vs. atuais. Transcrição áudio → texto com SpeechRecognition e PyDub; análise de sentimentos com Transformers (Hugging Face). Visualização e comparação por época.</w:t>
+        <w:t xml:space="preserve">Pipeline NLP comparando músicas dos anos 80 vs. atuais. SpeechRecognition + PyDub para transcrição; Transformers (Hugging Face) para análise.</w:t>
       </w:r>
     </w:p>
     <w:p>
@@ -2909,7 +2909,7 @@
           <w:sz w:val="20"/>
           <w:szCs w:val="20"/>
         </w:rPr>
-        <w:t xml:space="preserve">Projeto integrado de Machine Learning sobre o dataset Diabetes 130-US Hospitals (UCI / Kaggle, ~101 mil registos, 50 variáveis, target: readmissão hospitalar). Pipeline completo: análise exploratória e preparação dos dados, treino e comparação de modelos interpretáveis (regressão logística, árvore de decisão) com modelos de caixa negra (Random Forest / SVM), aplicação de métodos de interpretabilidade global (PDP, importância de features, SHAP) e local (LIME, contrafactuais), e análise crítica de riscos algorítmicos, ética e enquadramento regulamentar (AI Act, RGPD). Mestrado em IA Aplicada, Universidade Europeia.</w:t>
+        <w:t xml:space="preserve">Projeto sobre o dataset Diabetes 130-US Hospitals (~101k registos, 50 variáveis). Modelos interpretáveis vs. caixa negra; SHAP, LIME, contrafactuais; análise ética e regulamentar (AI Act, RGPD). Mestrado em IA Aplicada.</w:t>
       </w:r>
     </w:p>
     <w:p>
@@ -3149,7 +3149,7 @@
                 <w:sz w:val="18"/>
                 <w:szCs w:val="18"/>
               </w:rPr>
-              <w:t xml:space="preserve">Teacher Certificate in Mindfulness-Based Stress Reduction (MBSR)</w:t>
+              <w:t xml:space="preserve">Teacher Certificate in MBSR</w:t>
             </w:r>
           </w:p>
         </w:tc>
@@ -3364,7 +3364,7 @@
                 <w:sz w:val="18"/>
                 <w:szCs w:val="18"/>
               </w:rPr>
-              <w:t xml:space="preserve">Programa de Especialização Boosting Productivity with AI</w:t>
+              <w:t xml:space="preserve">Programa Boosting Productivity with AI</w:t>
             </w:r>
           </w:p>
         </w:tc>
@@ -3484,7 +3484,7 @@
                 <w:sz w:val="18"/>
                 <w:szCs w:val="18"/>
               </w:rPr>
-              <w:t xml:space="preserve">Medicina del Estilo de Vida Aplicada a la Salud Mental – Certificado de Competência (com excelência)</w:t>
+              <w:t xml:space="preserve">Medicina del Estilo de Vida Aplicada a la Salud Mental</w:t>
             </w:r>
           </w:p>
         </w:tc>
@@ -3576,7 +3576,7 @@
                 <w:sz w:val="18"/>
                 <w:szCs w:val="18"/>
               </w:rPr>
-              <w:t xml:space="preserve">Instituto de Ciências Contemplativas e UBImedical, 2022</w:t>
+              <w:t xml:space="preserve">ICC e UBImedical, 2022</w:t>
             </w:r>
           </w:p>
         </w:tc>
@@ -3636,7 +3636,7 @@
                 <w:sz w:val="18"/>
                 <w:szCs w:val="18"/>
               </w:rPr>
-              <w:t xml:space="preserve">Crearte Coaching &amp; American Union of NLP, 2020</w:t>
+              <w:t xml:space="preserve">Crearte Coaching &amp; AUNLP, 2020</w:t>
             </w:r>
           </w:p>
         </w:tc>
@@ -3664,7 +3664,7 @@
                 <w:sz w:val="18"/>
                 <w:szCs w:val="18"/>
               </w:rPr>
-              <w:t xml:space="preserve">Cursos avançados de IVA em Portugal e em Angola</w:t>
+              <w:t xml:space="preserve">Cursos avançados de IVA em PT e Angola</w:t>
             </w:r>
           </w:p>
         </w:tc>
@@ -3696,7 +3696,7 @@
                 <w:sz w:val="18"/>
                 <w:szCs w:val="18"/>
               </w:rPr>
-              <w:t xml:space="preserve">Universidade Católica / Angola, 2019</w:t>
+              <w:t xml:space="preserve">Univ. Católica / Angola, 2019</w:t>
             </w:r>
           </w:p>
         </w:tc>
@@ -3849,7 +3849,7 @@
                 <w:sz w:val="18"/>
                 <w:szCs w:val="18"/>
               </w:rPr>
-              <w:t xml:space="preserve">Python (análise, automação, ML), Power BI, Excel avançado, SPSS, R, KNIME, Google Colab, LLMs (ChatGPT, Claude, NotebookLM), Zapier, n8n, automação e construção de agentes</w:t>
+              <w:t xml:space="preserve">Python (ML, automação), Power BI, SPSS, R, KNIME, Google Colab, LLMs (ChatGPT, Claude, NotebookLM), Zapier, n8n, agentes</w:t>
             </w:r>
           </w:p>
         </w:tc>
@@ -3907,7 +3907,7 @@
                 <w:sz w:val="18"/>
                 <w:szCs w:val="18"/>
               </w:rPr>
-              <w:t xml:space="preserve">SAP, PHC, Primavera, MES; integração front-office / back-office (lojas, clínicas, logística, finanças)</w:t>
+              <w:t xml:space="preserve">SAP, PHC, Primavera, MES; integração back-office (lojas, clínicas, logística, finanças)</w:t>
             </w:r>
           </w:p>
         </w:tc>
@@ -3965,7 +3965,7 @@
                 <w:sz w:val="18"/>
                 <w:szCs w:val="18"/>
               </w:rPr>
-              <w:t xml:space="preserve">Lean Management, TQM, Balanced Scorecard, HACCP, ISO 9000/22000, desenho de processos, auditoria, melhoria contínua</w:t>
+              <w:t xml:space="preserve">Lean Management, TQM, Balanced Scorecard, HACCP, ISO 9000/22000, auditoria, melhoria contínua</w:t>
             </w:r>
           </w:p>
         </w:tc>
@@ -4023,7 +4023,7 @@
                 <w:sz w:val="18"/>
                 <w:szCs w:val="18"/>
               </w:rPr>
-              <w:t xml:space="preserve">Gestão de centros logísticos, armazéns e transporte, otimização de fluxos, mercados Angola e RDC</w:t>
+              <w:t xml:space="preserve">Gestão de centros logísticos, armazéns e transporte, otimização de fluxos</w:t>
             </w:r>
           </w:p>
         </w:tc>

</xml_diff>